<commit_message>
Reword the Kenedy proposal transmittal and closing
Replaces the generic "pleased to submit" line with the client-facing
wording adapted from the Bexar County ESD No. 12 bid letter, retargeted to
the two Kenedy projects. Splits it as an opener and a closing line, with
"bid" changed to "proposal" (these are design proposals, not a
construction bid) and the comma splice corrected to a semicolon.

Trims the leading spacer paragraphs to three and adds keepNext to the
signature block so the added text stays on a single page.

Co-Authored-By: Claude Opus 5 <noreply@anthropic.com>
Claude-Session: https://claude.ai/code/session_01WNmjsRm7QaUiaxW4jaW5ia
</commit_message>
<xml_diff>
--- a/Triun_Proposal_Kenedy_26-228_26-229.docx
+++ b/Triun_Proposal_Kenedy_26-228_26-229.docx
@@ -2,39 +2,6 @@
 <file path=word/document.xml><?xml version="1.0" encoding="utf-8"?>
 <w:document xmlns:wpc="http://schemas.microsoft.com/office/word/2010/wordprocessingCanvas" xmlns:cx="http://schemas.microsoft.com/office/drawing/2014/chartex" xmlns:cx1="http://schemas.microsoft.com/office/drawing/2015/9/8/chartex" xmlns:cx2="http://schemas.microsoft.com/office/drawing/2015/10/21/chartex" xmlns:cx3="http://schemas.microsoft.com/office/drawing/2016/5/9/chartex" xmlns:cx4="http://schemas.microsoft.com/office/drawing/2016/5/10/chartex" xmlns:cx5="http://schemas.microsoft.com/office/drawing/2016/5/11/chartex" xmlns:cx6="http://schemas.microsoft.com/office/drawing/2016/5/12/chartex" xmlns:cx7="http://schemas.microsoft.com/office/drawing/2016/5/13/chartex" xmlns:cx8="http://schemas.microsoft.com/office/drawing/2016/5/14/chartex" xmlns:mc="http://schemas.openxmlformats.org/markup-compatibility/2006" xmlns:aink="http://schemas.microsoft.com/office/drawing/2016/ink" xmlns:am3d="http://schemas.microsoft.com/office/drawing/2017/model3d" xmlns:o="urn:schemas-microsoft-com:office:office" xmlns:oel="http://schemas.microsoft.com/office/2019/extlst" xmlns:r="http://schemas.openxmlformats.org/officeDocument/2006/relationships" xmlns:m="http://schemas.openxmlformats.org/officeDocument/2006/math" xmlns:v="urn:schemas-microsoft-com:vml" xmlns:wp14="http://schemas.microsoft.com/office/word/2010/wordprocessingDrawing" xmlns:wp="http://schemas.openxmlformats.org/drawingml/2006/wordprocessingDrawing" xmlns:w10="urn:schemas-microsoft-com:office:word" xmlns:w="http://schemas.openxmlformats.org/wordprocessingml/2006/main" xmlns:w14="http://schemas.microsoft.com/office/word/2010/wordml" xmlns:w15="http://schemas.microsoft.com/office/word/2012/wordml" xmlns:w16cex="http://schemas.microsoft.com/office/word/2018/wordml/cex" xmlns:w16cid="http://schemas.microsoft.com/office/word/2016/wordml/cid" xmlns:w16="http://schemas.microsoft.com/office/word/2018/wordml" xmlns:w16du="http://schemas.microsoft.com/office/word/2023/wordml/word16du" xmlns:w16sdtdh="http://schemas.microsoft.com/office/word/2020/wordml/sdtdatahash" xmlns:w16sdtfl="http://schemas.microsoft.com/office/word/2024/wordml/sdtformatlock" xmlns:w16se="http://schemas.microsoft.com/office/word/2015/wordml/symex" xmlns:wpg="http://schemas.microsoft.com/office/word/2010/wordprocessingGroup" xmlns:wpi="http://schemas.microsoft.com/office/word/2010/wordprocessingInk" xmlns:wne="http://schemas.microsoft.com/office/word/2006/wordml" xmlns:wps="http://schemas.microsoft.com/office/word/2010/wordprocessingShape" mc:Ignorable="w14 w15 w16se w16cid w16 w16cex w16sdtdh w16sdtfl w16du wp14">
   <w:body>
-    <w:p>
-      <w:pPr>
-        <w:spacing w:before="1"/>
-        <w:ind w:right="2710"/>
-        <w:rPr>
-          <w:rFonts w:ascii="Times New Roman"/>
-          <w:color w:val="FFFFFF" w:themeColor="background1"/>
-          <w:sz w:val="18"/>
-        </w:rPr>
-      </w:pPr>
-    </w:p>
-    <w:p>
-      <w:pPr>
-        <w:spacing w:before="1"/>
-        <w:ind w:right="2710"/>
-        <w:rPr>
-          <w:rFonts w:ascii="Times New Roman"/>
-          <w:color w:val="FFFFFF" w:themeColor="background1"/>
-          <w:sz w:val="18"/>
-        </w:rPr>
-      </w:pPr>
-    </w:p>
-    <w:p>
-      <w:pPr>
-        <w:spacing w:before="1"/>
-        <w:ind w:right="2710"/>
-        <w:rPr>
-          <w:rFonts w:ascii="Times New Roman"/>
-          <w:color w:val="FFFFFF" w:themeColor="background1"/>
-          <w:sz w:val="18"/>
-        </w:rPr>
-      </w:pPr>
-    </w:p>
     <w:p>
       <w:pPr>
         <w:spacing w:before="1"/>
@@ -210,7 +177,7 @@
           <w:sz w:val="22"/>
           <w:szCs w:val="22"/>
         </w:rPr>
-        <w:t xml:space="preserve">Triun is pleased to submit the following proposals for your consideration.</w:t>
+        <w:t xml:space="preserve">Thank you for the opportunity to submit these proposals for the City of Kenedy Convention Center HVAC Replacement and Joe Gulley Park Remote Power Additions.</w:t>
       </w:r>
     </w:p>
     <w:p>
@@ -737,7 +704,7 @@
     </w:p>
     <w:p>
       <w:pPr>
-        <w:spacing w:before="120" w:after="360"/>
+        <w:spacing w:before="0" w:after="280"/>
         <w:contextualSpacing w:val="0"/>
         <w:rPr>
           <w:rFonts w:ascii="Times New Roman" w:hAnsi="Times New Roman" w:cs="Times New Roman"/>
@@ -751,11 +718,34 @@
           <w:sz w:val="22"/>
           <w:szCs w:val="22"/>
         </w:rPr>
+        <w:t xml:space="preserve">Please contact me if you have any questions regarding our proposal documents; I look forward to hearing from you.</w:t>
+      </w:r>
+    </w:p>
+    <w:p>
+      <w:pPr>
+        <w:keepNext/>
+        <w:keepLines/>
+        <w:spacing w:before="0" w:after="320"/>
+        <w:contextualSpacing w:val="0"/>
+        <w:rPr>
+          <w:rFonts w:ascii="Times New Roman" w:hAnsi="Times New Roman" w:cs="Times New Roman"/>
+          <w:sz w:val="22"/>
+          <w:szCs w:val="22"/>
+        </w:rPr>
+      </w:pPr>
+      <w:r>
+        <w:rPr>
+          <w:rFonts w:ascii="Times New Roman" w:hAnsi="Times New Roman" w:cs="Times New Roman"/>
+          <w:sz w:val="22"/>
+          <w:szCs w:val="22"/>
+        </w:rPr>
         <w:t xml:space="preserve">Thanks,</w:t>
       </w:r>
     </w:p>
     <w:p>
       <w:pPr>
+        <w:keepNext/>
+        <w:keepLines/>
         <w:spacing w:before="0" w:after="0"/>
         <w:contextualSpacing w:val="0"/>
         <w:rPr>
@@ -779,6 +769,8 @@
     </w:p>
     <w:p>
       <w:pPr>
+        <w:keepNext/>
+        <w:keepLines/>
         <w:spacing w:before="0" w:after="0"/>
         <w:contextualSpacing w:val="0"/>
         <w:rPr>

</xml_diff>